<commit_message>
Correct Wang 2021 curve inclusion, re-run absolute-risk synthesis, fix M2 study count and Shiny window filter
Exclude two Wang Y 2021 rectal panels that reported pCR/perineural invasion rather than ctDNA status; add the genuine post-neoadjuvant ctDNA curve. Re-run M1/M3/M6 on 95 two-state contrasts (190 arms; 11,297 reconstructed patients; 3,041 events). Correct longitudinal count to 8 serial studies / 39 trajectories across manuscript, figures and SI. Regenerate Figure 1-3, 5-6, S3 validation package (95 overlays), S2 CINeMA and all outputs. Fix Shiny app window-filter bug, refresh continuous curves (7 cells), redeploy. Add .gitignore entries for local rsconnect and scratch scripts.
</commit_message>
<xml_diff>
--- a/supplementary/S3b_KM_reconstruction_validation_legends.docx
+++ b/supplementary/S3b_KM_reconstruction_validation_legends.docx
@@ -38,7 +38,7 @@
           <w:i/>
           <w:sz w:val="20"/>
         </w:rPr>
-        <w:t>Suggested placement: Supplementary Methods (section on data reconstruction) and the Supplementary Figure/Table list. The numbering (Figure S__, Table S__) should be set to match the Supplementary Information. The 96 panels are provided as individual high-resolution PNGs (see 00_index.csv for ordering) bundled in SFig_KM_overlay_96panels.zip; the validation workbook is S3_KM_reconstruction_HR_validation.xlsx.</w:t>
+        <w:t>Suggested placement: Supplementary Methods (section on data reconstruction) and the Supplementary Figure/Table list. The numbering (Figure S__, Table S__) should be set to match the Supplementary Information. The 95 panels are provided as individual high-resolution PNGs (see 00_index.csv for ordering) bundled in SFig_KM_overlay_95panels.zip; the validation workbook is S3_KM_reconstruction_HR_validation.xlsx.</w:t>
       </w:r>
     </w:p>
     <w:p>
@@ -80,7 +80,7 @@
           <w:i w:val="0"/>
           <w:sz w:val="22"/>
         </w:rPr>
-        <w:t>Because the pooled absolute-risk estimates are derived entirely from individual-participant data reconstructed from published Kaplan–Meier curves rather than from raw patient data, we performed a three-part validation of the reconstruction across every two-state comparison in the review (96 comparisons, 192 Kaplan–Meier arms, 5,657 digitised coordinates, 11,431 reconstructed patients and 3,064 reconstructed events). All code and the per-comparison output are provided in the analysis repository (R/M1a_reconstruct_IPD.R; python/S3b_km_overlay_hr_validation.py).</w:t>
+        <w:t>Because the pooled absolute-risk estimates are derived entirely from individual-participant data reconstructed from published Kaplan–Meier curves rather than from raw patient data, we performed a three-part validation of the reconstruction across every two-state comparison in the review (95 comparisons, 190 Kaplan–Meier arms, 5,616 digitised coordinates, 11,297 reconstructed patients and 3,041 reconstructed events). All code and the per-comparison output are provided in the analysis repository (R/M1a_reconstruct_IPD.R; python/S3b_km_overlay_hr_validation.py).</w:t>
       </w:r>
     </w:p>
     <w:p>
@@ -150,7 +150,7 @@
           <w:i w:val="0"/>
           <w:sz w:val="22"/>
         </w:rPr>
-        <w:t>Validation results. The median arm-level overlay MAE was 0.02 (interquartile range 0.01–0.031); 190 of 192 arms (99.0%) had an MAE ≤ 0.10 and all 192 arms (100%) had an MAE ≤ 0.15. Of the 87 comparisons with a numeric source HR and an estimable reconstructed HR, 84 published HRs lay within the reconstructed 95% confidence interval and three used the inverse reference group (their reciprocals fell within the interval), giving 87/87 (100%) agreement with zero residual mismatches. Among the 80 same-calibre unadjusted source HRs, 80/80 (100%) agreed and the Spearman correlation of log HR (excluding the reference-group inversions) was 0.951. Of the seven adjusted/multivariable source HRs, six lay directly within the interval and one (Benhaim 2021, 19-KM3) agreed after inversion of the reference group; all seven were direction-consistent once the reference direction was accounted for. The three reference-group inversions were Wang Y 2021 (5-KM4A, reconstructed 11.80 versus reported 0.086), Zhou J 2025 post-ACT (30-KM5a, reconstructed 0.23 versus reported 19.15) and Benhaim 2021 (19-KM3, adjusted, reconstructed 0.29 versus reported 5.00); in each case the source reported the HR for the opposite comparison direction.</w:t>
+        <w:t>Validation results. The median arm-level overlay MAE was 0.02 (interquartile range 0.011–0.031); 188 of 190 arms (98.9%) had an MAE ≤ 0.10 and all 190 arms (100%) had an MAE ≤ 0.15. Of the 86 comparisons with a numeric source HR and an estimable reconstructed HR, 84 published HRs lay within the reconstructed 95% confidence interval and two used the inverse reference group (their reciprocals fell within the interval), giving 86/86 (100%) agreement with zero residual mismatches. Among the 79 same-calibre unadjusted source HRs, 78 lay directly within the interval and one (Zhou J 2025 post-ACT, 30-KM5a) was a reciprocal match; excluding that single reference-group inversion, the Spearman correlation between reconstructed and published log HRs was 0.95. Of the seven adjusted/multivariable source HRs, six lay directly within the interval and one (Benhaim 2021, 19-KM3) agreed after inversion of the reference group; all seven were direction-consistent once the reference direction was accounted for. The two reference-group inversions were Zhou J 2025 post-ACT (30-KM5a, reconstructed 0.23 versus reported 19.15) and Benhaim 2021 (19-KM3, adjusted, reconstructed 0.29 versus reported 5.00); in each case the source reported the HR for the opposite comparison direction.</w:t>
       </w:r>
     </w:p>
     <w:p>
@@ -234,7 +234,7 @@
           <w:i w:val="0"/>
           <w:sz w:val="22"/>
         </w:rPr>
-        <w:t>After these corrections no arm carries a SEVERE NAR flag. Four arms retain a MINOR NAR flag (Newhook 2023, 27-KM1A/KM1C/KM1D; Mo S 2023, 4-KM-S3C; violation 0.06–0.10): their event counts and curve endpoints are consistent with their NAR tables and only small early-time geometry deviations remain, so they are retained with a footnote. Two further arms (Akiyoshi 2025, 6-KM5B, positive n = 3; Li P 2026, 37-KM3A, negative n = 9) are labelled sparse-NAR/timing-only: with only a baseline and a terminal NAR entry their within-interval timing is not identifiable, and they are used for pooled estimates only with no positive point estimate.</w:t>
+        <w:t>After these corrections no arm carries a SEVERE NAR flag. Four arms retain a MINOR NAR flag (Newhook 2023, 27-KM1A/KM1C/KM1D; Mo S 2023, 4-KM-S3C; violation 0.06–0.105): their event counts and curve endpoints are consistent with their NAR tables and only small early-time geometry deviations remain, so they are retained with a footnote. Two further arms (Akiyoshi 2025, 6-KM5B, positive n = 3; Li P 2026, 37-KM3A, negative n = 9) are labelled sparse-NAR/timing-only: with only a baseline and a terminal NAR entry their within-interval timing is not identifiable, and they are used for pooled estimates only with no positive point estimate.</w:t>
       </w:r>
     </w:p>
     <w:p>
@@ -262,7 +262,7 @@
           <w:i w:val="0"/>
           <w:sz w:val="22"/>
         </w:rPr>
-        <w:t>Figure S__. Reconstruction-validation overlays for all 96 two-state comparisons (one panel per comparison; panels are ordered as in 00_index.csv). Open circles are the digitised points of the source Kaplan–Meier curve and solid step lines are the Kaplan–Meier curves re-estimated from the reconstructed IPD; red denotes the ctDNA-positive/high-risk arm and dark blue the ctDNA-negative/low-risk arm. Each legend entry reports the arm sample size (n), the number of events and the within-window overlay MAE. The upper-right box reports the reconstructed unadjusted HR (95% CI) and, where available, the source-reported HR and its type. A banner at the foot of a panel identifies an arm whose digitised points are mathematically inconsistent with its number-at-risk table (digitization_flags). The median arm MAE was 0.02, 99.0% of arms had an MAE ≤ 0.10 and all arms had an MAE ≤ 0.15; after source verification no panel carries a SEVERE banner.</w:t>
+        <w:t>Figure S__. Reconstruction-validation overlays for all 95 two-state comparisons (one panel per comparison; panels are ordered as in 00_index.csv). Open circles are the digitised points of the source Kaplan–Meier curve and solid step lines are the Kaplan–Meier curves re-estimated from the reconstructed IPD; red denotes the ctDNA-positive/high-risk arm and dark blue the ctDNA-negative/low-risk arm. Each legend entry reports the arm sample size (n), the number of events and the within-window overlay MAE. The upper-right box reports the reconstructed unadjusted HR (95% CI) and, where available, the source-reported HR and its type. A banner at the foot of a panel identifies an arm whose digitised points are mathematically inconsistent with its number-at-risk table (digitization_flags). The median arm MAE was 0.02, 98.9% of arms had an MAE ≤ 0.10 and all arms had an MAE ≤ 0.15; after source verification no panel carries a SEVERE banner.</w:t>
       </w:r>
     </w:p>
     <w:p>
@@ -366,7 +366,9 @@
             <w:tcW w:type="dxa" w:w="907"/>
           </w:tcPr>
           <w:p>
-            <w:r/>
+            <w:r>
+              <w:t>95</w:t>
+            </w:r>
             <w:r>
               <w:rPr>
                 <w:rFonts w:ascii="Times New Roman" w:hAnsi="Times New Roman" w:eastAsia="Times New Roman"/>
@@ -374,7 +376,6 @@
                 <w:i w:val="0"/>
                 <w:sz w:val="19"/>
               </w:rPr>
-              <w:t>96</w:t>
             </w:r>
           </w:p>
         </w:tc>
@@ -419,7 +420,9 @@
             <w:tcW w:type="dxa" w:w="907"/>
           </w:tcPr>
           <w:p>
-            <w:r/>
+            <w:r>
+              <w:t>190</w:t>
+            </w:r>
             <w:r>
               <w:rPr>
                 <w:rFonts w:ascii="Times New Roman" w:hAnsi="Times New Roman" w:eastAsia="Times New Roman"/>
@@ -427,7 +430,6 @@
                 <w:i w:val="0"/>
                 <w:sz w:val="19"/>
               </w:rPr>
-              <w:t>192</w:t>
             </w:r>
           </w:p>
         </w:tc>
@@ -472,7 +474,9 @@
             <w:tcW w:type="dxa" w:w="907"/>
           </w:tcPr>
           <w:p>
-            <w:r/>
+            <w:r>
+              <w:t>4</w:t>
+            </w:r>
             <w:r>
               <w:rPr>
                 <w:rFonts w:ascii="Times New Roman" w:hAnsi="Times New Roman" w:eastAsia="Times New Roman"/>
@@ -480,7 +484,6 @@
                 <w:i w:val="0"/>
                 <w:sz w:val="19"/>
               </w:rPr>
-              <w:t>6</w:t>
             </w:r>
           </w:p>
         </w:tc>
@@ -489,7 +492,9 @@
             <w:tcW w:type="dxa" w:w="6236"/>
           </w:tcPr>
           <w:p>
-            <w:r/>
+            <w:r>
+              <w:t>The four arms with MINOR NAR violations (retained with a footnote); the two sparse-NAR/timing-only arms are described in the methods text.</w:t>
+            </w:r>
             <w:r>
               <w:rPr>
                 <w:rFonts w:ascii="Times New Roman" w:hAnsi="Times New Roman" w:eastAsia="Times New Roman"/>
@@ -497,7 +502,6 @@
                 <w:i w:val="0"/>
                 <w:sz w:val="19"/>
               </w:rPr>
-              <w:t>The six non-ok arms: four MINOR NAR flags (retained with a footnote) and two sparse-NAR/timing-only arms, with severity and recommended action.</w:t>
             </w:r>
           </w:p>
         </w:tc>
@@ -525,7 +529,9 @@
             <w:tcW w:type="dxa" w:w="907"/>
           </w:tcPr>
           <w:p>
-            <w:r/>
+            <w:r>
+              <w:t>7</w:t>
+            </w:r>
             <w:r>
               <w:rPr>
                 <w:rFonts w:ascii="Times New Roman" w:hAnsi="Times New Roman" w:eastAsia="Times New Roman"/>
@@ -533,7 +539,6 @@
                 <w:i w:val="0"/>
                 <w:sz w:val="19"/>
               </w:rPr>
-              <w:t>8</w:t>
             </w:r>
           </w:p>
         </w:tc>
@@ -542,7 +547,9 @@
             <w:tcW w:type="dxa" w:w="6236"/>
           </w:tcPr>
           <w:p>
-            <w:r/>
+            <w:r>
+              <w:t>Approximate two-stage leave-one-out analysis quantifying the influence of Lygre 2024 (50-KM1): primary vs exclusion for the positive arm at 12 and 24 months; the 12-month estimate was 54.4% including versus 53.2% excluding Lygre.</w:t>
+            </w:r>
             <w:r>
               <w:rPr>
                 <w:rFonts w:ascii="Times New Roman" w:hAnsi="Times New Roman" w:eastAsia="Times New Roman"/>
@@ -550,7 +557,6 @@
                 <w:i w:val="0"/>
                 <w:sz w:val="19"/>
               </w:rPr>
-              <w:t>REML two-stage leave-one-out analysis quantifying the influence of Lygre 2024 (50-KM1): primary vs exclusion for the positive and negative arms at 12 and 24 months; the positive 12-month CIR is unchanged at 53.2%.</w:t>
             </w:r>
           </w:p>
         </w:tc>
@@ -595,7 +601,9 @@
             <w:tcW w:type="dxa" w:w="6236"/>
           </w:tcPr>
           <w:p>
-            <w:r/>
+            <w:r>
+              <w:t>Headline validation counts and percentages (95 comparisons; 86/86 HR agreement; 79 same-calibre unadjusted with Spearman 0.95; MAE ≤ 0.10 in 188/190).</w:t>
+            </w:r>
             <w:r>
               <w:rPr>
                 <w:rFonts w:ascii="Times New Roman" w:hAnsi="Times New Roman" w:eastAsia="Times New Roman"/>
@@ -603,7 +611,6 @@
                 <w:i w:val="0"/>
                 <w:sz w:val="19"/>
               </w:rPr>
-              <w:t>Headline validation counts and percentages (96 comparisons; 87/87 HR agreement; 80/80 unadjusted; Spearman 0.951; MAE ≤ 0.10 in 190/192).</w:t>
             </w:r>
           </w:p>
         </w:tc>
@@ -737,7 +744,9 @@
             <w:tcW w:type="dxa" w:w="907"/>
           </w:tcPr>
           <w:p>
-            <w:r/>
+            <w:r>
+              <w:t>67</w:t>
+            </w:r>
             <w:r>
               <w:rPr>
                 <w:rFonts w:ascii="Times New Roman" w:hAnsi="Times New Roman" w:eastAsia="Times New Roman"/>
@@ -745,7 +754,6 @@
                 <w:i w:val="0"/>
                 <w:sz w:val="19"/>
               </w:rPr>
-              <w:t>63</w:t>
             </w:r>
           </w:p>
         </w:tc>

</xml_diff>